<commit_message>
Agregar cláusula de conciliación previa (Ley 26872) a ambos contratos
Investigación confirma que la conciliación extrajudicial no es exigible
para el desalojo (ordinario ni notarial exprés Ley 30933), pero sí es
requisito de procedibilidad para demandar el cobro dinerario por la vía
declarativa, y que el acta con acuerdo total tiene mérito de título de
ejecución (art. 18 Ley 26872), habilitando embargo directo en semanas si
el inquilino incumple lo conciliado. Se añade como nueva Cláusula Décimo
Sétima, dejando expresamente a salvo la cláusula resolutoria (Cláusula
Octava) y el desalojo notarial exprés, y renumerando Legalización de
Firmas a Décimo Octava.

Co-Authored-By: Claude Sonnet 5 <noreply@anthropic.com>
Claude-Session: https://claude.ai/code/session_01B4wmKbWjzrrC8SoWhTJnfM
</commit_message>
<xml_diff>
--- a/contratos/Contrato_Arrendamiento_Taller_Mecanica_Automotriz.docx
+++ b/contratos/Contrato_Arrendamiento_Taller_Mecanica_Automotriz.docx
@@ -628,7 +628,7 @@
           <w:sz w:val="22"/>
           <w:szCs w:val="22"/>
         </w:rPr>
-        <w:t xml:space="preserve">Ambas partes legalizarán sus firmas en el presente contrato ante Notario Público, conforme a lo dispuesto en la Cláusula Décimo Sétima, sometiéndose expresamente al procedimiento especial de desalojo con intervención notarial regulado por la Ley N° 30933 y su reglamento, para lo cual EL ARRENDATARIO se ALLANA, desde ya y de forma irrevocable, a la restitución de EL INMUEBLE en caso de resolución del contrato por la causal señalada en el numeral 8.1, así como al vencimiento del plazo contractual pactado en la Cláusula Cuarta;</w:t>
+        <w:t xml:space="preserve">Ambas partes legalizarán sus firmas en el presente contrato ante Notario Público, conforme a lo dispuesto en la Cláusula Décimo Octava, sometiéndose expresamente al procedimiento especial de desalojo con intervención notarial regulado por la Ley N° 30933 y su reglamento, para lo cual EL ARRENDATARIO se ALLANA, desde ya y de forma irrevocable, a la restitución de EL INMUEBLE en caso de resolución del contrato por la causal señalada en el numeral 8.1, así como al vencimiento del plazo contractual pactado en la Cláusula Cuarta;</w:t>
       </w:r>
     </w:p>
     <w:p>
@@ -683,7 +683,7 @@
           <w:sz w:val="22"/>
           <w:szCs w:val="22"/>
         </w:rPr>
-        <w:t xml:space="preserve">Nota informativa: el embargo de bienes no opera de forma automática por la sola firma de este contrato; requiere, como mínimo, la legalización notarial de firmas y el trámite del procedimiento notarial o judicial correspondiente conforme a la Cláusula Décimo Sétima.</w:t>
+        <w:t xml:space="preserve">Nota informativa: el embargo de bienes no opera de forma automática por la sola firma de este contrato; requiere, como mínimo, la legalización notarial de firmas y el trámite del procedimiento notarial o judicial correspondiente conforme a la Cláusula Décimo Octava.</w:t>
       </w:r>
     </w:p>
     <w:p>
@@ -1141,7 +1141,77 @@
           <w:sz w:val="22"/>
           <w:szCs w:val="22"/>
         </w:rPr>
-        <w:t xml:space="preserve">CLÁUSULA DÉCIMO SÉTIMA: LEGALIZACIÓN DE FIRMAS</w:t>
+        <w:t xml:space="preserve">CLÁUSULA DÉCIMO SÉTIMA: CONCILIACIÓN PREVIA</w:t>
+      </w:r>
+    </w:p>
+    <w:p>
+      <w:pPr>
+        <w:spacing w:after="200" w:line="300"/>
+        <w:jc w:val="both"/>
+      </w:pPr>
+      <w:r>
+        <w:rPr>
+          <w:rFonts w:ascii="Times New Roman" w:cs="Times New Roman" w:eastAsia="Times New Roman" w:hAnsi="Times New Roman"/>
+          <w:b w:val="false"/>
+          <w:bCs w:val="false"/>
+          <w:i w:val="false"/>
+          <w:iCs w:val="false"/>
+          <w:sz w:val="22"/>
+          <w:szCs w:val="22"/>
+        </w:rPr>
+        <w:t xml:space="preserve">Las partes acuerdan que toda controversia que surja de la interpretación, ejecución o incumplimiento del presente contrato, en particular el cobro de rentas adeudadas y sus intereses, deberá intentar resolverse primero mediante conciliación extrajudicial ante un Centro de Conciliación acreditado por el Ministerio de Justicia y Derechos Humanos (MINJUS), como paso previo a la vía judicial que corresponda por obligación de dar suma de dinero, conforme a la Ley N° 26872 y su Reglamento.</w:t>
+      </w:r>
+    </w:p>
+    <w:p>
+      <w:pPr>
+        <w:spacing w:after="200" w:line="300"/>
+        <w:jc w:val="both"/>
+      </w:pPr>
+      <w:r>
+        <w:rPr>
+          <w:rFonts w:ascii="Times New Roman" w:cs="Times New Roman" w:eastAsia="Times New Roman" w:hAnsi="Times New Roman"/>
+          <w:b w:val="false"/>
+          <w:bCs w:val="false"/>
+          <w:i w:val="false"/>
+          <w:iCs w:val="false"/>
+          <w:sz w:val="22"/>
+          <w:szCs w:val="22"/>
+        </w:rPr>
+        <w:t xml:space="preserve">La parte interesada cursará la invitación a conciliar, procurando agotar dicho intento en un plazo máximo de diez (10) días hábiles contados desde la primera citación válida, sin perjuicio del plazo legal de la audiencia. El acuerdo conciliatorio total o parcial que se suscriba constituye título de ejecución conforme al artículo 18° de la Ley N° 26872, con la misma eficacia que una sentencia con calidad de cosa juzgada, pudiendo LA ARRENDADORA solicitar directamente su ejecución y el EMBARGO de los bienes de EL ARRENDATARIO y/o de su(s) garante(s) solidario(s) en caso de incumplimiento.</w:t>
+      </w:r>
+    </w:p>
+    <w:p>
+      <w:pPr>
+        <w:spacing w:after="200" w:line="300"/>
+        <w:jc w:val="both"/>
+      </w:pPr>
+      <w:r>
+        <w:rPr>
+          <w:rFonts w:ascii="Times New Roman" w:cs="Times New Roman" w:eastAsia="Times New Roman" w:hAnsi="Times New Roman"/>
+          <w:b w:val="false"/>
+          <w:bCs w:val="false"/>
+          <w:i w:val="false"/>
+          <w:iCs w:val="false"/>
+          <w:sz w:val="22"/>
+          <w:szCs w:val="22"/>
+        </w:rPr>
+        <w:t xml:space="preserve">Queda expresamente establecido que la presente cláusula NO resulta aplicable ni condiciona el ejercicio de la vía de desalojo notarial exprés regulada por la Ley N° 30933, ni de la cláusula resolutoria expresa pactada en la Cláusula Octava conforme al artículo 1430° del Código Civil, ni de cualquier otra vía de cobranza o resolución contractual prevista en este contrato. En consecuencia, si EL ARRENDATARIO no asiste a la audiencia de conciliación, o asistiendo no se llega a acuerdo, o incumple el acuerdo conciliatorio suscrito, LA ARRENDADORA queda en absoluta libertad de iniciar de inmediato, y sin necesidad de trámite adicional, el proceso o vía de cobranza y/o desalojo que estime pertinente, incluyendo la ejecución del acta de conciliación como título ejecutivo cuando corresponda.</w:t>
+      </w:r>
+    </w:p>
+    <w:p>
+      <w:pPr>
+        <w:spacing w:after="150" w:before="300"/>
+        <w:jc w:val="both"/>
+      </w:pPr>
+      <w:r>
+        <w:rPr>
+          <w:rFonts w:ascii="Times New Roman" w:cs="Times New Roman" w:eastAsia="Times New Roman" w:hAnsi="Times New Roman"/>
+          <w:b/>
+          <w:bCs/>
+          <w:sz w:val="22"/>
+          <w:szCs w:val="22"/>
+        </w:rPr>
+        <w:t xml:space="preserve">CLÁUSULA DÉCIMO OCTAVA: LEGALIZACIÓN DE FIRMAS</w:t>
       </w:r>
     </w:p>
     <w:p>

</xml_diff>